<commit_message>
Update CV and portfolio resume content
</commit_message>
<xml_diff>
--- a/My-Portfolio-main/public/SohamBiswasCV.docx
+++ b/My-Portfolio-main/public/SohamBiswasCV.docx
@@ -56,11 +56,7 @@
       <w:bookmarkStart w:id="0" w:name="_Hlk218332234"/>
       <w:r>
         <w:fldChar w:fldCharType="begin"/>
-      </w:r>
-      <w:r>
         <w:instrText>HYPERLINK "https://www.linkedin.com/in/soham1810/"</w:instrText>
-      </w:r>
-      <w:r>
         <w:fldChar w:fldCharType="separate"/>
       </w:r>
       <w:r>
@@ -72,8 +68,6 @@
       <w:bookmarkEnd w:id="0"/>
       <w:r>
         <w:fldChar w:fldCharType="end"/>
-      </w:r>
-      <w:r>
         <w:t xml:space="preserve"> </w:t>
       </w:r>
       <w:r>
@@ -94,19 +88,11 @@
         <w:t xml:space="preserve"> </w:t>
       </w:r>
       <w:hyperlink r:id="rId6">
-        <w:proofErr w:type="spellStart"/>
         <w:r>
           <w:rPr>
             <w:rFonts w:ascii="Times New Roman" w:hAnsi="Times New Roman" w:cs="Times New Roman"/>
           </w:rPr>
-          <w:t>Github</w:t>
-        </w:r>
-        <w:proofErr w:type="spellEnd"/>
-        <w:r>
-          <w:rPr>
-            <w:rFonts w:ascii="Times New Roman" w:hAnsi="Times New Roman" w:cs="Times New Roman"/>
-          </w:rPr>
-          <w:t>:</w:t>
+          <w:t>Github:</w:t>
         </w:r>
       </w:hyperlink>
       <w:r>
@@ -119,11 +105,7 @@
       <w:bookmarkStart w:id="1" w:name="_Hlk218332265"/>
       <w:r>
         <w:fldChar w:fldCharType="begin"/>
-      </w:r>
-      <w:r>
         <w:instrText>HYPERLINK "https://github.com/SohamB1810/"</w:instrText>
-      </w:r>
-      <w:r>
         <w:fldChar w:fldCharType="separate"/>
       </w:r>
       <w:r>
@@ -167,7 +149,7 @@
     <w:p>
       <w:pPr>
         <w:pStyle w:val="Heading1"/>
-        <w:spacing w:before="112"/>
+        <w:spacing w:before="60"/>
         <w:rPr>
           <w:rFonts w:ascii="Times New Roman" w:hAnsi="Times New Roman" w:cs="Times New Roman"/>
         </w:rPr>
@@ -268,7 +250,7 @@
         <w:tabs>
           <w:tab w:val="left" w:pos="2165"/>
         </w:tabs>
-        <w:spacing w:before="34"/>
+        <w:spacing w:before="20"/>
         <w:ind w:left="134"/>
         <w:rPr>
           <w:rFonts w:ascii="Times New Roman" w:hAnsi="Times New Roman" w:cs="Times New Roman"/>
@@ -299,6 +281,7 @@
           <w:sz w:val="20"/>
         </w:rPr>
         <w:tab/>
+        <w:t xml:space="preserve"> </w:t>
       </w:r>
       <w:r>
         <w:rPr>
@@ -312,7 +295,7 @@
         <w:tabs>
           <w:tab w:val="left" w:pos="2165"/>
         </w:tabs>
-        <w:spacing w:before="34"/>
+        <w:spacing w:before="20"/>
         <w:ind w:left="134"/>
         <w:rPr>
           <w:rFonts w:ascii="Times New Roman" w:hAnsi="Times New Roman" w:cs="Times New Roman"/>
@@ -332,7 +315,7 @@
         <w:rPr>
           <w:rFonts w:ascii="Times New Roman" w:hAnsi="Times New Roman" w:cs="Times New Roman"/>
         </w:rPr>
-        <w:t xml:space="preserve">                 Spring Boot, Next.js, React.js, Node.js, HTML, CSS, Tailwind CSS</w:t>
+        <w:t xml:space="preserve">                  Spring Boot, Next.js, React.js, Node.js, HTML, CSS, Tailwind CSS</w:t>
       </w:r>
     </w:p>
     <w:p>
@@ -341,8 +324,8 @@
         <w:tabs>
           <w:tab w:val="left" w:pos="2165"/>
         </w:tabs>
-        <w:spacing w:before="61"/>
-        <w:ind w:left="0"/>
+        <w:spacing w:before="30"/>
+        <w:ind w:left="2165" w:hanging="2031"/>
         <w:rPr>
           <w:rFonts w:ascii="Times New Roman" w:hAnsi="Times New Roman" w:cs="Times New Roman"/>
           <w:lang w:val="en-IN"/>
@@ -355,7 +338,7 @@
           <w:color w:val="2D2F92"/>
           <w:spacing w:val="-2"/>
         </w:rPr>
-        <w:t xml:space="preserve">   Tools/Platforms</w:t>
+        <w:t>Tools/Platforms</w:t>
       </w:r>
       <w:r>
         <w:rPr>
@@ -375,28 +358,14 @@
           <w:rFonts w:ascii="Times New Roman" w:hAnsi="Times New Roman" w:cs="Times New Roman"/>
           <w:spacing w:val="-9"/>
         </w:rPr>
-        <w:t xml:space="preserve"> </w:t>
+        <w:t xml:space="preserve">  </w:t>
       </w:r>
       <w:r>
         <w:rPr>
           <w:rFonts w:ascii="Times New Roman" w:hAnsi="Times New Roman" w:cs="Times New Roman"/>
           <w:lang w:val="en-IN"/>
         </w:rPr>
-        <w:t xml:space="preserve">MySQL, PostgreSQL, MongoDB, Apache Kafka, Docker, Kubernetes, Git, GitHub, Maven, IntelliJ IDEA, </w:t>
-      </w:r>
-      <w:r>
-        <w:rPr>
-          <w:rFonts w:ascii="Times New Roman" w:hAnsi="Times New Roman" w:cs="Times New Roman"/>
-          <w:lang w:val="en-IN"/>
-        </w:rPr>
-        <w:t xml:space="preserve">                                                                                                  </w:t>
-      </w:r>
-      <w:r>
-        <w:rPr>
-          <w:rFonts w:ascii="Times New Roman" w:hAnsi="Times New Roman" w:cs="Times New Roman"/>
-          <w:lang w:val="en-IN"/>
-        </w:rPr>
-        <w:t>AWS, CI/CD, REST API, Microservices</w:t>
+        <w:t>MySQL, PostgreSQL, MongoDB, Apache Kafka, Docker, Kubernetes, Git, GitHub, Maven, IntelliJ   IDEA, AWS, CI/CD, REST API, Microservices</w:t>
       </w:r>
       <w:r>
         <w:rPr>
@@ -418,8 +387,8 @@
         <w:tabs>
           <w:tab w:val="left" w:pos="2182"/>
         </w:tabs>
-        <w:spacing w:before="58"/>
-        <w:ind w:left="134"/>
+        <w:spacing w:before="28"/>
+        <w:ind w:left="2182" w:hanging="2048"/>
         <w:rPr>
           <w:rFonts w:ascii="Times New Roman" w:hAnsi="Times New Roman" w:cs="Times New Roman"/>
         </w:rPr>
@@ -430,20 +399,13 @@
           <w:b/>
           <w:color w:val="2D2F92"/>
         </w:rPr>
-        <w:t>Core CS Fundamentals:</w:t>
-      </w:r>
-      <w:r>
-        <w:rPr>
-          <w:sz w:val="22"/>
-          <w:szCs w:val="22"/>
-        </w:rPr>
-        <w:t xml:space="preserve"> </w:t>
-      </w:r>
-      <w:r>
-        <w:rPr>
-          <w:rFonts w:ascii="Times New Roman" w:hAnsi="Times New Roman" w:cs="Times New Roman"/>
-        </w:rPr>
-        <w:t xml:space="preserve">Database Management Systems (DBMS), Operating Systems, SQL, Object-Oriented Programming (OOP), Data Structures and Algorithms (DSA), Computer Networks, Software Development Life Cycle (SDLC)  </w:t>
+        <w:t xml:space="preserve">Core CS Fundamentals: </w:t>
+      </w:r>
+      <w:r>
+        <w:rPr>
+          <w:rFonts w:ascii="Times New Roman" w:hAnsi="Times New Roman" w:cs="Times New Roman"/>
+        </w:rPr>
+        <w:t xml:space="preserve">Data Structures &amp; Algorithms, Object-Oriented Programming, Database Management Systems, Operating Systems, Computer Networks, SDLC  </w:t>
       </w:r>
     </w:p>
     <w:p>
@@ -452,7 +414,7 @@
         <w:tabs>
           <w:tab w:val="left" w:pos="2182"/>
         </w:tabs>
-        <w:spacing w:before="58"/>
+        <w:spacing w:before="28"/>
         <w:ind w:left="134"/>
         <w:rPr>
           <w:rFonts w:ascii="Times New Roman" w:hAnsi="Times New Roman" w:cs="Times New Roman"/>
@@ -497,7 +459,7 @@
           <w:rFonts w:ascii="Times New Roman" w:hAnsi="Times New Roman" w:cs="Times New Roman"/>
         </w:rPr>
         <w:tab/>
-        <w:t>Problem-Solving,</w:t>
+        <w:t xml:space="preserve"> Problem-Solving,</w:t>
       </w:r>
       <w:r>
         <w:rPr>
@@ -575,7 +537,7 @@
     <w:p>
       <w:pPr>
         <w:pStyle w:val="Heading1"/>
-        <w:spacing w:before="120"/>
+        <w:spacing w:before="60"/>
         <w:rPr>
           <w:rFonts w:ascii="Times New Roman" w:hAnsi="Times New Roman" w:cs="Times New Roman"/>
         </w:rPr>
@@ -675,7 +637,7 @@
         <w:tabs>
           <w:tab w:val="left" w:pos="9806"/>
         </w:tabs>
-        <w:spacing w:before="35"/>
+        <w:spacing w:before="20"/>
         <w:ind w:left="134"/>
         <w:rPr>
           <w:rFonts w:ascii="Times New Roman" w:hAnsi="Times New Roman" w:cs="Times New Roman"/>
@@ -683,7 +645,6 @@
           <w:sz w:val="20"/>
         </w:rPr>
       </w:pPr>
-      <w:proofErr w:type="spellStart"/>
       <w:r>
         <w:rPr>
           <w:rFonts w:ascii="Times New Roman" w:hAnsi="Times New Roman" w:cs="Times New Roman"/>
@@ -692,18 +653,7 @@
           <w:color w:val="2D2F92"/>
           <w:sz w:val="20"/>
         </w:rPr>
-        <w:t>NexaBank</w:t>
-      </w:r>
-      <w:proofErr w:type="spellEnd"/>
-      <w:r>
-        <w:rPr>
-          <w:rFonts w:ascii="Times New Roman" w:hAnsi="Times New Roman" w:cs="Times New Roman"/>
-          <w:b/>
-          <w:bCs/>
-          <w:color w:val="2D2F92"/>
-          <w:sz w:val="20"/>
-        </w:rPr>
-        <w:t xml:space="preserve"> – Enterprise Banking Microservices Platform</w:t>
+        <w:t>NexaBank – Enterprise Banking Microservices Platform</w:t>
       </w:r>
       <w:r>
         <w:rPr>
@@ -749,23 +699,7 @@
           <w:rFonts w:ascii="Times New Roman" w:hAnsi="Times New Roman" w:cs="Times New Roman"/>
           <w:sz w:val="20"/>
         </w:rPr>
-        <w:t>march’</w:t>
-      </w:r>
-      <w:r>
-        <w:rPr>
-          <w:rFonts w:ascii="Times New Roman" w:hAnsi="Times New Roman" w:cs="Times New Roman"/>
-          <w:spacing w:val="-9"/>
-          <w:sz w:val="20"/>
-        </w:rPr>
-        <w:t xml:space="preserve"> </w:t>
-      </w:r>
-      <w:r>
-        <w:rPr>
-          <w:rFonts w:ascii="Times New Roman" w:hAnsi="Times New Roman" w:cs="Times New Roman"/>
-          <w:spacing w:val="-5"/>
-          <w:sz w:val="20"/>
-        </w:rPr>
-        <w:t xml:space="preserve">26      </w:t>
+        <w:t>Mar 2026</w:t>
       </w:r>
       <w:r>
         <w:rPr>
@@ -773,29 +707,11 @@
           <w:sz w:val="20"/>
         </w:rPr>
         <w:br/>
-        <w:t>• Architected and developed 23 Spring Boot microservices for accounts, transactions, loans &amp; payments with Kafka-driven event streaming for real-time data processing.</w:t>
-      </w:r>
-      <w:r>
-        <w:rPr>
-          <w:rFonts w:ascii="Times New Roman" w:hAnsi="Times New Roman" w:cs="Times New Roman"/>
-          <w:sz w:val="20"/>
-        </w:rPr>
+        <w:t>• Architected 23 Spring Boot microservices covering accounts, transactions, loans and payments — each service runs independently and communicates in real time using Apache Kafka event streaming, so a failure in one service does not bring down the rest.</w:t>
         <w:br/>
-        <w:t>• Implemented API security using JWT authentication, OAuth2 authorization, and API Gateway with rate limiting &amp; circuit breakers; achieved 99.9% service availability and fault tolerance.</w:t>
-      </w:r>
-      <w:r>
-        <w:rPr>
-          <w:rFonts w:ascii="Times New Roman" w:hAnsi="Times New Roman" w:cs="Times New Roman"/>
-          <w:sz w:val="20"/>
-        </w:rPr>
+        <w:t>• Secured every API endpoint with JWT authentication and OAuth2 authorization; deployed an API Gateway with rate limiting and circuit breakers to control traffic and prevent cascading failures — achieving 99.9% service availability.</w:t>
         <w:br/>
-        <w:t>• Containerized and deployed services using Docker &amp; Kubernetes; reduced inter-service latency by 40% via asynchronous messaging and CI/CD pipeline optimization.</w:t>
-      </w:r>
-      <w:r>
-        <w:rPr>
-          <w:rFonts w:ascii="Times New Roman" w:hAnsi="Times New Roman" w:cs="Times New Roman"/>
-          <w:sz w:val="20"/>
-        </w:rPr>
+        <w:t>• Containerized all services with Docker, orchestrated deployments on Kubernetes, and built a CI/CD pipeline for automated testing and releases — cutting inter-service response time by 40% through async messaging.</w:t>
         <w:br/>
         <w:t xml:space="preserve">• </w:t>
       </w:r>
@@ -814,7 +730,7 @@
         <w:tabs>
           <w:tab w:val="left" w:pos="9806"/>
         </w:tabs>
-        <w:spacing w:before="35"/>
+        <w:spacing w:before="20"/>
         <w:ind w:left="134"/>
         <w:rPr>
           <w:rFonts w:ascii="Times New Roman" w:hAnsi="Times New Roman" w:cs="Times New Roman"/>
@@ -829,7 +745,7 @@
         <w:tabs>
           <w:tab w:val="left" w:pos="9806"/>
         </w:tabs>
-        <w:spacing w:before="35"/>
+        <w:spacing w:before="20"/>
         <w:ind w:left="134"/>
         <w:rPr>
           <w:rFonts w:ascii="Times New Roman" w:hAnsi="Times New Roman" w:cs="Times New Roman"/>
@@ -837,7 +753,6 @@
           <w:sz w:val="20"/>
         </w:rPr>
       </w:pPr>
-      <w:proofErr w:type="spellStart"/>
       <w:r>
         <w:rPr>
           <w:rFonts w:ascii="Times New Roman" w:hAnsi="Times New Roman" w:cs="Times New Roman"/>
@@ -846,18 +761,7 @@
           <w:color w:val="2D2F92"/>
           <w:sz w:val="20"/>
         </w:rPr>
-        <w:t>Voltex</w:t>
-      </w:r>
-      <w:proofErr w:type="spellEnd"/>
-      <w:r>
-        <w:rPr>
-          <w:rFonts w:ascii="Times New Roman" w:hAnsi="Times New Roman" w:cs="Times New Roman"/>
-          <w:b/>
-          <w:bCs/>
-          <w:color w:val="2D2F92"/>
-          <w:sz w:val="20"/>
-        </w:rPr>
-        <w:t xml:space="preserve"> – Full-Stack E-Commerce Platform</w:t>
+        <w:t>Voltex – Full-Stack E-Commerce Platform</w:t>
       </w:r>
       <w:r>
         <w:rPr>
@@ -902,15 +806,7 @@
           <w:rFonts w:ascii="Times New Roman" w:hAnsi="Times New Roman" w:cs="Times New Roman"/>
           <w:sz w:val="20"/>
         </w:rPr>
-        <w:t>march’</w:t>
-      </w:r>
-      <w:r>
-        <w:rPr>
-          <w:rFonts w:ascii="Times New Roman" w:hAnsi="Times New Roman" w:cs="Times New Roman"/>
-          <w:spacing w:val="-5"/>
-          <w:sz w:val="20"/>
-        </w:rPr>
-        <w:t>26</w:t>
+        <w:t>Mar 2026</w:t>
       </w:r>
       <w:r>
         <w:rPr>
@@ -926,32 +822,11 @@
           <w:sz w:val="20"/>
           <w:szCs w:val="20"/>
         </w:rPr>
-        <w:t>• Designed and built a responsive full stack e-commerce application using Next.js 14 App Router and Spring Boot REST APIs with secure Stripe payment gateway integration.</w:t>
-      </w:r>
-      <w:r>
-        <w:rPr>
-          <w:rFonts w:ascii="Times New Roman" w:hAnsi="Times New Roman" w:cs="Times New Roman"/>
-          <w:sz w:val="20"/>
-          <w:szCs w:val="20"/>
-        </w:rPr>
+        <w:t>• Designed and built a fully responsive e-commerce platform using Next.js 14 App Router for the frontend and Spring Boot REST APIs for the backend, with secure Stripe payment gateway integration for real-time checkout and order tracking.</w:t>
         <w:br/>
-        <w:t>• Developed modular admin dashboard for product, order, inventory &amp; user management with JWT-based role-based access control (RBAC) authentication.</w:t>
-      </w:r>
-      <w:r>
-        <w:rPr>
-          <w:rFonts w:ascii="Times New Roman" w:hAnsi="Times New Roman" w:cs="Times New Roman"/>
-          <w:sz w:val="20"/>
-          <w:szCs w:val="20"/>
-        </w:rPr>
+        <w:t>• Built a modular admin dashboard for managing products, orders, inventory and users — with JWT-based Role-Based Access Control (RBAC) so only authorised staff can access sensitive operations.</w:t>
         <w:br/>
-        <w:t>• Optimized frontend performance using Tailwind CSS and Server-Side Rendering (SSR), achieving sub-2s load time and responsive mobile-first UX design.</w:t>
-      </w:r>
-      <w:r>
-        <w:rPr>
-          <w:rFonts w:ascii="Times New Roman" w:hAnsi="Times New Roman" w:cs="Times New Roman"/>
-          <w:sz w:val="20"/>
-          <w:szCs w:val="20"/>
-        </w:rPr>
+        <w:t>• Optimized frontend performance using Tailwind CSS and Server-Side Rendering (SSR), achieving a sub-2s load time and a fully responsive mobile-first design.</w:t>
         <w:br/>
         <w:t xml:space="preserve">• </w:t>
       </w:r>
@@ -969,7 +844,7 @@
     <w:p>
       <w:pPr>
         <w:pStyle w:val="Heading1"/>
-        <w:spacing w:before="120"/>
+        <w:spacing w:before="60"/>
         <w:rPr>
           <w:rFonts w:ascii="Times New Roman" w:hAnsi="Times New Roman" w:cs="Times New Roman"/>
         </w:rPr>
@@ -1069,7 +944,7 @@
         <w:tabs>
           <w:tab w:val="left" w:pos="8985"/>
         </w:tabs>
-        <w:spacing w:before="34"/>
+        <w:spacing w:before="20"/>
         <w:ind w:left="134"/>
         <w:jc w:val="both"/>
         <w:rPr>
@@ -1127,7 +1002,7 @@
           <w:rFonts w:ascii="Times New Roman" w:hAnsi="Times New Roman" w:cs="Times New Roman"/>
           <w:sz w:val="20"/>
         </w:rPr>
-        <w:t>May’</w:t>
+        <w:t>May 2025</w:t>
       </w:r>
       <w:r>
         <w:rPr>
@@ -1142,45 +1017,7 @@
           <w:rFonts w:ascii="Times New Roman" w:hAnsi="Times New Roman" w:cs="Times New Roman"/>
           <w:sz w:val="20"/>
         </w:rPr>
-        <w:t>25</w:t>
-      </w:r>
-      <w:r>
-        <w:rPr>
-          <w:rFonts w:ascii="Times New Roman" w:hAnsi="Times New Roman" w:cs="Times New Roman"/>
-          <w:spacing w:val="-3"/>
-          <w:sz w:val="20"/>
-        </w:rPr>
-        <w:t xml:space="preserve"> </w:t>
-      </w:r>
-      <w:r>
-        <w:rPr>
-          <w:rFonts w:ascii="Times New Roman" w:hAnsi="Times New Roman" w:cs="Times New Roman"/>
-          <w:sz w:val="20"/>
-        </w:rPr>
-        <w:t>–</w:t>
-      </w:r>
-      <w:r>
-        <w:rPr>
-          <w:rFonts w:ascii="Times New Roman" w:hAnsi="Times New Roman" w:cs="Times New Roman"/>
-          <w:spacing w:val="-3"/>
-          <w:sz w:val="20"/>
-        </w:rPr>
-        <w:t xml:space="preserve"> </w:t>
-      </w:r>
-      <w:r>
-        <w:rPr>
-          <w:rFonts w:ascii="Times New Roman" w:hAnsi="Times New Roman" w:cs="Times New Roman"/>
-          <w:sz w:val="20"/>
-        </w:rPr>
-        <w:t>Jun’</w:t>
-      </w:r>
-      <w:r>
-        <w:rPr>
-          <w:rFonts w:ascii="Times New Roman" w:hAnsi="Times New Roman" w:cs="Times New Roman"/>
-          <w:spacing w:val="-5"/>
-          <w:sz w:val="20"/>
-        </w:rPr>
-        <w:t xml:space="preserve"> 25</w:t>
+        <w:t xml:space="preserve">– Jun 2025</w:t>
       </w:r>
     </w:p>
     <w:p>
@@ -1192,7 +1029,7 @@
         <w:tabs>
           <w:tab w:val="left" w:pos="8985"/>
         </w:tabs>
-        <w:spacing w:before="34"/>
+        <w:spacing w:before="20"/>
         <w:jc w:val="both"/>
         <w:rPr>
           <w:rFonts w:ascii="Times New Roman" w:hAnsi="Times New Roman" w:cs="Times New Roman"/>
@@ -1206,7 +1043,7 @@
           <w:bCs/>
           <w:sz w:val="20"/>
         </w:rPr>
-        <w:t>Built a real-time video calling web application using React.js, Node.js, MongoDB, WebRTC, and Socket.io with peer-to-peer communication.</w:t>
+        <w:t>Built a real-time video calling app using React.js, Node.js, MongoDB, WebRTC and Socket.io with peer-to-peer browser communication.</w:t>
       </w:r>
       <w:r>
         <w:rPr>
@@ -1226,7 +1063,7 @@
         <w:tabs>
           <w:tab w:val="left" w:pos="8985"/>
         </w:tabs>
-        <w:spacing w:before="34"/>
+        <w:spacing w:before="20"/>
         <w:jc w:val="both"/>
         <w:rPr>
           <w:rFonts w:ascii="Times New Roman" w:hAnsi="Times New Roman" w:cs="Times New Roman"/>
@@ -1240,7 +1077,7 @@
           <w:bCs/>
           <w:sz w:val="20"/>
         </w:rPr>
-        <w:t>Worked on frontend-backend integration, RESTful APIs, and real-time signaling mechanisms using WebSocket technology.</w:t>
+        <w:t>Integrated frontend and backend using REST APIs and WebSockets for real-time signaling between users.</w:t>
       </w:r>
       <w:r>
         <w:rPr>
@@ -1260,7 +1097,7 @@
         <w:tabs>
           <w:tab w:val="left" w:pos="8985"/>
         </w:tabs>
-        <w:spacing w:before="34"/>
+        <w:spacing w:before="20"/>
         <w:jc w:val="both"/>
         <w:rPr>
           <w:rFonts w:ascii="Times New Roman" w:hAnsi="Times New Roman" w:cs="Times New Roman"/>
@@ -1274,7 +1111,7 @@
           <w:bCs/>
           <w:sz w:val="20"/>
         </w:rPr>
-        <w:t>Gained hands-on experience in full stack web development, agile methodology, and real-time communication systems</w:t>
+        <w:t>Gained practical experience in full-stack development, agile methodology, and real-time communication systems.</w:t>
       </w:r>
       <w:r>
         <w:rPr>
@@ -1397,7 +1234,7 @@
         <w:tabs>
           <w:tab w:val="left" w:pos="9873"/>
         </w:tabs>
-        <w:spacing w:before="114"/>
+        <w:spacing w:before="50"/>
         <w:jc w:val="both"/>
         <w:rPr>
           <w:rFonts w:ascii="Times New Roman" w:hAnsi="Times New Roman" w:cs="Times New Roman"/>
@@ -1410,23 +1247,7 @@
           <w:rFonts w:ascii="Times New Roman" w:hAnsi="Times New Roman" w:cs="Times New Roman"/>
           <w:sz w:val="20"/>
         </w:rPr>
-        <w:t xml:space="preserve">Oracle </w:t>
-      </w:r>
-      <w:proofErr w:type="spellStart"/>
-      <w:r>
-        <w:rPr>
-          <w:rFonts w:ascii="Times New Roman" w:hAnsi="Times New Roman" w:cs="Times New Roman"/>
-          <w:sz w:val="20"/>
-        </w:rPr>
-        <w:t>Database@AWS</w:t>
-      </w:r>
-      <w:proofErr w:type="spellEnd"/>
-      <w:r>
-        <w:rPr>
-          <w:rFonts w:ascii="Times New Roman" w:hAnsi="Times New Roman" w:cs="Times New Roman"/>
-          <w:sz w:val="20"/>
-        </w:rPr>
-        <w:t xml:space="preserve"> Certified Architect Professional – Oracle | </w:t>
+        <w:t xml:space="preserve">Oracle Database@AWS Certified Architect Professional – Oracle | </w:t>
       </w:r>
       <w:hyperlink r:id="rId10" w:history="1">
         <w:r>
@@ -1481,7 +1302,7 @@
         <w:tabs>
           <w:tab w:val="left" w:pos="9873"/>
         </w:tabs>
-        <w:spacing w:before="114"/>
+        <w:spacing w:before="50"/>
         <w:jc w:val="both"/>
         <w:rPr>
           <w:rFonts w:ascii="Times New Roman" w:hAnsi="Times New Roman" w:cs="Times New Roman"/>
@@ -1529,7 +1350,7 @@
         <w:tabs>
           <w:tab w:val="left" w:pos="9873"/>
         </w:tabs>
-        <w:spacing w:before="114"/>
+        <w:spacing w:before="50"/>
         <w:jc w:val="both"/>
         <w:rPr>
           <w:rFonts w:ascii="Times New Roman" w:hAnsi="Times New Roman" w:cs="Times New Roman"/>
@@ -1561,13 +1382,6 @@
           <w:sz w:val="20"/>
         </w:rPr>
         <w:t xml:space="preserve">                                    </w:t>
-      </w:r>
-      <w:r>
-        <w:rPr>
-          <w:rFonts w:ascii="Times New Roman" w:hAnsi="Times New Roman" w:cs="Times New Roman"/>
-          <w:i/>
-          <w:sz w:val="20"/>
-        </w:rPr>
         <w:tab/>
         <w:t xml:space="preserve">     oct’25</w:t>
       </w:r>
@@ -1575,7 +1389,7 @@
     <w:p>
       <w:pPr>
         <w:pStyle w:val="Heading1"/>
-        <w:spacing w:before="120"/>
+        <w:spacing w:before="60"/>
         <w:rPr>
           <w:rFonts w:ascii="Times New Roman" w:hAnsi="Times New Roman" w:cs="Times New Roman"/>
         </w:rPr>
@@ -1675,7 +1489,7 @@
         <w:tabs>
           <w:tab w:val="left" w:pos="8985"/>
         </w:tabs>
-        <w:spacing w:before="34"/>
+        <w:spacing w:before="20"/>
         <w:jc w:val="both"/>
         <w:rPr>
           <w:rFonts w:ascii="Times New Roman" w:hAnsi="Times New Roman" w:cs="Times New Roman"/>
@@ -1905,7 +1719,7 @@
         <w:tabs>
           <w:tab w:val="left" w:pos="8913"/>
         </w:tabs>
-        <w:spacing w:before="35"/>
+        <w:spacing w:before="20"/>
         <w:ind w:left="134"/>
         <w:rPr>
           <w:rFonts w:ascii="Times New Roman" w:hAnsi="Times New Roman" w:cs="Times New Roman"/>
@@ -2013,17 +1827,7 @@
           <w:rFonts w:ascii="Times New Roman" w:hAnsi="Times New Roman" w:cs="Times New Roman"/>
         </w:rPr>
         <w:t>B.Tech. CSE; TGPA: 7.5</w:t>
-      </w:r>
-      <w:r>
-        <w:rPr>
-          <w:rFonts w:ascii="Times New Roman" w:hAnsi="Times New Roman" w:cs="Times New Roman"/>
-        </w:rPr>
         <w:tab/>
-      </w:r>
-      <w:r>
-        <w:rPr>
-          <w:rFonts w:ascii="Times New Roman" w:hAnsi="Times New Roman" w:cs="Times New Roman"/>
-        </w:rPr>
         <w:tab/>
         <w:t xml:space="preserve">          2023</w:t>
       </w:r>
@@ -2095,34 +1899,16 @@
           <w:sz w:val="20"/>
         </w:rPr>
         <w:t xml:space="preserve">  </w:t>
-      </w:r>
-      <w:r>
-        <w:rPr>
-          <w:rFonts w:ascii="Times New Roman" w:hAnsi="Times New Roman" w:cs="Times New Roman"/>
-          <w:b/>
-          <w:color w:val="2D2F92"/>
-          <w:sz w:val="20"/>
-        </w:rPr>
         <w:tab/>
         <w:t xml:space="preserve">  </w:t>
       </w:r>
-      <w:proofErr w:type="spellStart"/>
       <w:r>
         <w:rPr>
           <w:rFonts w:ascii="Times New Roman" w:hAnsi="Times New Roman" w:cs="Times New Roman"/>
           <w:spacing w:val="-2"/>
           <w:sz w:val="20"/>
         </w:rPr>
-        <w:t>Yamunanagar</w:t>
-      </w:r>
-      <w:proofErr w:type="spellEnd"/>
-      <w:r>
-        <w:rPr>
-          <w:rFonts w:ascii="Times New Roman" w:hAnsi="Times New Roman" w:cs="Times New Roman"/>
-          <w:spacing w:val="-2"/>
-          <w:sz w:val="20"/>
-        </w:rPr>
-        <w:t>,</w:t>
+        <w:t>Yamunanagar,</w:t>
       </w:r>
       <w:r>
         <w:rPr>
@@ -2207,7 +1993,7 @@
         <w:tabs>
           <w:tab w:val="left" w:pos="8714"/>
         </w:tabs>
-        <w:spacing w:before="114"/>
+        <w:spacing w:before="50"/>
         <w:ind w:left="134"/>
         <w:jc w:val="both"/>
         <w:rPr>
@@ -2244,23 +2030,13 @@
         <w:tab/>
         <w:t xml:space="preserve">   </w:t>
       </w:r>
-      <w:proofErr w:type="spellStart"/>
       <w:r>
         <w:rPr>
           <w:rFonts w:ascii="Times New Roman" w:hAnsi="Times New Roman" w:cs="Times New Roman"/>
           <w:spacing w:val="-2"/>
           <w:sz w:val="20"/>
         </w:rPr>
-        <w:t>Yamunanagar</w:t>
-      </w:r>
-      <w:proofErr w:type="spellEnd"/>
-      <w:r>
-        <w:rPr>
-          <w:rFonts w:ascii="Times New Roman" w:hAnsi="Times New Roman" w:cs="Times New Roman"/>
-          <w:spacing w:val="-2"/>
-          <w:sz w:val="20"/>
-        </w:rPr>
-        <w:t>,</w:t>
+        <w:t>Yamunanagar,</w:t>
       </w:r>
       <w:r>
         <w:rPr>

</xml_diff>